<commit_message>
Corrige un renvoi inexact au mémoire de mi-parcours
Le mémoire de mi-parcours ne décrit pas une notion calculée
différemment selon l'outil, mais l'impossibilité d'écrire une règle de
gestion ailleurs que dans la génération du tableau. Le parallèle avec
les vues SQL est rétabli dans ce sens.

Co-Authored-By: Claude Opus 5 <noreply@anthropic.com>
Claude-Session: https://claude.ai/code/session_01Hs8PVJaTgyjq9e8Ud5Nqb9
</commit_message>
<xml_diff>
--- a/chapitre_2_copilote_financier.docx
+++ b/chapitre_2_copilote_financier.docx
@@ -1565,25 +1565,25 @@
         <w:t xml:space="preserve"> </w:t>
       </w:r>
       <w:r>
-        <w:t xml:space="preserve">fois, dans la vue, et les notebooks comme la plateforme consomment la même. C’est</w:t>
-      </w:r>
-      <w:r>
-        <w:t xml:space="preserve"> </w:t>
-      </w:r>
-      <w:r>
-        <w:t xml:space="preserve">exactement le problème que j’avais rencontré sur les reportings décrits dans mon mémoire de</w:t>
-      </w:r>
-      <w:r>
-        <w:t xml:space="preserve"> </w:t>
-      </w:r>
-      <w:r>
-        <w:t xml:space="preserve">mi-parcours, où la même notion pouvait être calculée différemment selon l’outil qui</w:t>
-      </w:r>
-      <w:r>
-        <w:t xml:space="preserve"> </w:t>
-      </w:r>
-      <w:r>
-        <w:t xml:space="preserve">l’interrogeait.</w:t>
+        <w:t xml:space="preserve">fois, dans la vue, et les notebooks comme la plateforme consomment la même. J’avais</w:t>
+      </w:r>
+      <w:r>
+        <w:t xml:space="preserve"> </w:t>
+      </w:r>
+      <w:r>
+        <w:t xml:space="preserve">rencontré la difficulté inverse sur les reportings du premier semestre, exposés dans mon</w:t>
+      </w:r>
+      <w:r>
+        <w:t xml:space="preserve"> </w:t>
+      </w:r>
+      <w:r>
+        <w:t xml:space="preserve">mémoire de mi-parcours : faute de pouvoir écrire une règle de gestion quelque part une fois</w:t>
+      </w:r>
+      <w:r>
+        <w:t xml:space="preserve"> </w:t>
+      </w:r>
+      <w:r>
+        <w:t xml:space="preserve">pour toutes, il fallait la recalculer à chaque génération du tableau.</w:t>
       </w:r>
     </w:p>
     <w:p>

</xml_diff>

<commit_message>
Applique les corrections de l'audit du chapitre 2
Retire dix-neuf formulations sans origine dans le brouillon, dont trois
paragraphes entiers, et les résidus de ton essayiste que la consigne
visait explicitement. Ouvre désormais les sections 2.4.4 et 2.4.5 par le
problème, glose les termes techniques restés opaques, aligne le
commentaire des figures 2.1 et 2.3 sur ce que les images montrent
réellement, et rend insécables les espaces devant les pourcentages et
les montants.

L'audit confirme par ailleurs que le sommaire imposé est respecté à la
lettre, qu'aucun chiffre du brouillon n'a été perdu ni inventé, et que
l'encadré de note de rédaction a entièrement disparu.

Co-Authored-By: Claude Opus 5 <noreply@anthropic.com>
Claude-Session: https://claude.ai/code/session_01Hs8PVJaTgyjq9e8Ud5Nqb9
</commit_message>
<xml_diff>
--- a/chapitre_2_copilote_financier.docx
+++ b/chapitre_2_copilote_financier.docx
@@ -544,7 +544,7 @@
         <w:t xml:space="preserve"> </w:t>
       </w:r>
       <w:r>
-        <w:t xml:space="preserve">par cas, sans grille ni justification chiffrée.</w:t>
+        <w:t xml:space="preserve">par cas.</w:t>
       </w:r>
     </w:p>
     <w:p>
@@ -564,25 +564,19 @@
         <w:t xml:space="preserve"> </w:t>
       </w:r>
       <w:r>
-        <w:t xml:space="preserve">C’est pourtant un problème de contrôle de gestion outillé par la donnée, et rien d’autre. Le matériau disponible se résume à 267 opérations et quatre exports Excel, soit</w:t>
-      </w:r>
-      <w:r>
-        <w:t xml:space="preserve"> </w:t>
-      </w:r>
-      <w:r>
-        <w:t xml:space="preserve">une photographie à date. Cette lucidité initiale sur la nature du problème a évité, je</w:t>
-      </w:r>
-      <w:r>
-        <w:t xml:space="preserve"> </w:t>
-      </w:r>
-      <w:r>
-        <w:t xml:space="preserve">crois, une bonne partie des erreurs que j’aurais pu commettre en cherchant à appliquer des</w:t>
-      </w:r>
-      <w:r>
-        <w:t xml:space="preserve"> </w:t>
-      </w:r>
-      <w:r>
-        <w:t xml:space="preserve">méthodes disproportionnées.</w:t>
+        <w:t xml:space="preserve">C’est pourtant un problème de contrôle de gestion outillé par la donnée, et rien d’autre.</w:t>
+      </w:r>
+      <w:r>
+        <w:t xml:space="preserve"> </w:t>
+      </w:r>
+      <w:r>
+        <w:t xml:space="preserve">Le matériau disponible se résume à 267 opérations et quatre exports Excel, soit une</w:t>
+      </w:r>
+      <w:r>
+        <w:t xml:space="preserve"> </w:t>
+      </w:r>
+      <w:r>
+        <w:t xml:space="preserve">photographie à date.</w:t>
       </w:r>
     </w:p>
     <w:bookmarkStart w:id="20" w:name="Xcacbc28e4963aea1e7cfa59f0a47a06bee732ec"/>
@@ -731,13 +725,7 @@
         <w:pStyle w:val="FirstParagraph"/>
       </w:pPr>
       <w:r>
-        <w:t xml:space="preserve">Quatre exigences non fonctionnelles ont cadré le travail, et je les ai posées avant de</w:t>
-      </w:r>
-      <w:r>
-        <w:t xml:space="preserve"> </w:t>
-      </w:r>
-      <w:r>
-        <w:t xml:space="preserve">commencer plutôt qu’après coup. La</w:t>
+        <w:t xml:space="preserve">Quatre exigences non fonctionnelles ont cadré le travail. La</w:t>
       </w:r>
       <w:r>
         <w:t xml:space="preserve"> </w:t>
@@ -784,13 +772,7 @@
         <w:t xml:space="preserve"> </w:t>
       </w:r>
       <w:r>
-        <w:t xml:space="preserve">déterminent, faute de quoi un contrôleur de gestion n’a aucune raison de lui faire</w:t>
-      </w:r>
-      <w:r>
-        <w:t xml:space="preserve"> </w:t>
-      </w:r>
-      <w:r>
-        <w:t xml:space="preserve">confiance. La</w:t>
+        <w:t xml:space="preserve">déterminent. La</w:t>
       </w:r>
       <w:r>
         <w:t xml:space="preserve"> </w:t>
@@ -1487,6 +1469,26 @@
         <w:t xml:space="preserve">d’une distance au littoral que j’ai calculée.</w:t>
       </w:r>
     </w:p>
+    <w:p>
+      <w:pPr>
+        <w:pStyle w:val="FirstParagraph"/>
+      </w:pPr>
+      <w:r>
+        <w:t xml:space="preserve">Ce détour par le script plutôt que par le téléchargement manuel a un coût en temps au</w:t>
+      </w:r>
+      <w:r>
+        <w:t xml:space="preserve"> </w:t>
+      </w:r>
+      <w:r>
+        <w:t xml:space="preserve">départ, mais c’est lui qui rend l’exigence de reproductibilité tenable jusqu’au bout de la</w:t>
+      </w:r>
+      <w:r>
+        <w:t xml:space="preserve"> </w:t>
+      </w:r>
+      <w:r>
+        <w:t xml:space="preserve">chaîne.</w:t>
+      </w:r>
+    </w:p>
     <w:bookmarkEnd w:id="25"/>
     <w:bookmarkEnd w:id="26"/>
     <w:bookmarkStart w:id="27" w:name="architecture-technique"/>
@@ -1565,25 +1567,19 @@
         <w:t xml:space="preserve"> </w:t>
       </w:r>
       <w:r>
-        <w:t xml:space="preserve">fois, dans la vue, et les notebooks comme la plateforme consomment la même. J’avais</w:t>
-      </w:r>
-      <w:r>
-        <w:t xml:space="preserve"> </w:t>
-      </w:r>
-      <w:r>
-        <w:t xml:space="preserve">rencontré la difficulté inverse sur les reportings du premier semestre, exposés dans mon</w:t>
-      </w:r>
-      <w:r>
-        <w:t xml:space="preserve"> </w:t>
-      </w:r>
-      <w:r>
-        <w:t xml:space="preserve">mémoire de mi-parcours : faute de pouvoir écrire une règle de gestion quelque part une fois</w:t>
-      </w:r>
-      <w:r>
-        <w:t xml:space="preserve"> </w:t>
-      </w:r>
-      <w:r>
-        <w:t xml:space="preserve">pour toutes, il fallait la recalculer à chaque génération du tableau.</w:t>
+        <w:t xml:space="preserve">fois, dans la vue, et les notebooks comme la plateforme consomment la même. C’est la</w:t>
+      </w:r>
+      <w:r>
+        <w:t xml:space="preserve"> </w:t>
+      </w:r>
+      <w:r>
+        <w:t xml:space="preserve">situation inverse de celle que décrit mon mémoire de mi-parcours, où la règle de gestion,</w:t>
+      </w:r>
+      <w:r>
+        <w:t xml:space="preserve"> </w:t>
+      </w:r>
+      <w:r>
+        <w:t xml:space="preserve">ne pouvant être écrite nulle part, devait être recalculée à chaque génération du tableau.</w:t>
       </w:r>
     </w:p>
     <w:p>
@@ -1650,13 +1646,13 @@
         <w:t xml:space="preserve"> </w:t>
       </w:r>
       <w:r>
-        <w:t xml:space="preserve">fortement asymétrique, avec un coefficient d’asymétrie de 19,2, interdisant d’appliquer</w:t>
-      </w:r>
-      <w:r>
-        <w:t xml:space="preserve"> </w:t>
-      </w:r>
-      <w:r>
-        <w:t xml:space="preserve">telle quelle une régression linéaire. Après passage au logarithme, la</w:t>
+        <w:t xml:space="preserve">fortement asymétrique, avec un coefficient d’asymétrie de 19,2, ce qui interdisait</w:t>
+      </w:r>
+      <w:r>
+        <w:t xml:space="preserve"> </w:t>
+      </w:r>
+      <w:r>
+        <w:t xml:space="preserve">d’appliquer telle quelle une régression linéaire. Après passage au logarithme, la</w:t>
       </w:r>
       <w:r>
         <w:t xml:space="preserve"> </w:t>
@@ -1674,19 +1670,19 @@
         <w:t xml:space="preserve"> </w:t>
       </w:r>
       <w:r>
-        <w:t xml:space="preserve">théorique, devient presque rectiligne. La Figure 2.1 montre les deux distributions côte à</w:t>
-      </w:r>
-      <w:r>
-        <w:t xml:space="preserve"> </w:t>
-      </w:r>
-      <w:r>
-        <w:t xml:space="preserve">côte. C’est ce constat qui a conduit l’axe C à modéliser le logarithme du prix plutôt que</w:t>
-      </w:r>
-      <w:r>
-        <w:t xml:space="preserve"> </w:t>
-      </w:r>
-      <w:r>
-        <w:t xml:space="preserve">le prix lui-même.</w:t>
+        <w:t xml:space="preserve">théorique, devient presque rectiligne. La Figure 2.1 rassemble les deux distributions et</w:t>
+      </w:r>
+      <w:r>
+        <w:t xml:space="preserve"> </w:t>
+      </w:r>
+      <w:r>
+        <w:t xml:space="preserve">les diagrammes quantile-quantile correspondants. C’est ce constat qui a conduit l’axe C à</w:t>
+      </w:r>
+      <w:r>
+        <w:t xml:space="preserve"> </w:t>
+      </w:r>
+      <w:r>
+        <w:t xml:space="preserve">modéliser le logarithme du prix plutôt que le prix lui-même.</w:t>
       </w:r>
     </w:p>
     <w:p>
@@ -1773,13 +1769,7 @@
         <w:t xml:space="preserve"> </w:t>
       </w:r>
       <w:r>
-        <w:t xml:space="preserve">vente, ce qui contredisait à la fois l’intuition des équipes commerciales et tout ce que</w:t>
-      </w:r>
-      <w:r>
-        <w:t xml:space="preserve"> </w:t>
-      </w:r>
-      <w:r>
-        <w:t xml:space="preserve">l’on sait du marché.</w:t>
+        <w:t xml:space="preserve">vente, ce qui contredisait tout ce que l’on sait du marché.</w:t>
       </w:r>
     </w:p>
     <w:p>
@@ -1934,13 +1924,13 @@
         <w:t xml:space="preserve"> </w:t>
       </w:r>
       <w:r>
-        <w:t xml:space="preserve">groupe dont le périmètre de données dépasse largement le sien. Le test est concluant,</w:t>
-      </w:r>
-      <w:r>
-        <w:t xml:space="preserve"> </w:t>
-      </w:r>
-      <w:r>
-        <w:t xml:space="preserve">mais par la négative. Sur notre volumétrie, 64 788 lignes représentant 9 Mo en mémoire,</w:t>
+        <w:t xml:space="preserve">groupe dont le périmètre de données dépasse largement le sien. Le test aboutit à une</w:t>
+      </w:r>
+      <w:r>
+        <w:t xml:space="preserve"> </w:t>
+      </w:r>
+      <w:r>
+        <w:t xml:space="preserve">conclusion négative, et c’est en cela qu’il est utile. Sur notre volumétrie, 64 788 lignes représentant 9 Mo en mémoire,</w:t>
       </w:r>
       <w:r>
         <w:t xml:space="preserve"> </w:t>
@@ -1972,25 +1962,19 @@
         <w:pStyle w:val="BodyText"/>
       </w:pPr>
       <w:r>
-        <w:t xml:space="preserve">SQLite et pandas constituent la bonne architecture à cette échelle, et il faut savoir le</w:t>
-      </w:r>
-      <w:r>
-        <w:t xml:space="preserve"> </w:t>
-      </w:r>
-      <w:r>
-        <w:t xml:space="preserve">dire plutôt que d’ajouter une technologie parce qu’elle figure au programme. L’intérêt du</w:t>
-      </w:r>
-      <w:r>
-        <w:t xml:space="preserve"> </w:t>
-      </w:r>
-      <w:r>
-        <w:t xml:space="preserve">test est ailleurs : le chemin de montée en charge est identifié et documenté, si le</w:t>
-      </w:r>
-      <w:r>
-        <w:t xml:space="preserve"> </w:t>
-      </w:r>
-      <w:r>
-        <w:t xml:space="preserve">périmètre devait un jour s’étendre à celui du groupe Nexity.</w:t>
+        <w:t xml:space="preserve">SQLite et pandas constituent donc la bonne architecture à cette échelle. L’intérêt du test</w:t>
+      </w:r>
+      <w:r>
+        <w:t xml:space="preserve"> </w:t>
+      </w:r>
+      <w:r>
+        <w:t xml:space="preserve">est ailleurs : le chemin de montée en charge est identifié, si le périmètre devait un jour</w:t>
+      </w:r>
+      <w:r>
+        <w:t xml:space="preserve"> </w:t>
+      </w:r>
+      <w:r>
+        <w:t xml:space="preserve">s’étendre à celui du groupe Nexity.</w:t>
       </w:r>
     </w:p>
     <w:bookmarkEnd w:id="35"/>
@@ -2090,7 +2074,7 @@
         <w:t xml:space="preserve"> </w:t>
       </w:r>
       <w:r>
-        <w:t xml:space="preserve">définition, avec des performances flatteuses et parfaitement trompeuses.</w:t>
+        <w:t xml:space="preserve">définition.</w:t>
       </w:r>
     </w:p>
     <w:p>
@@ -2122,7 +2106,13 @@
         <w:t xml:space="preserve"> </w:t>
       </w:r>
       <w:r>
-        <w:t xml:space="preserve">Figure 2.3 donne la distribution complète et situe ce seuil.</w:t>
+        <w:t xml:space="preserve">Figure 2.3 donne la distribution complète et situe ce seuil, avec à droite le détail des</w:t>
+      </w:r>
+      <w:r>
+        <w:t xml:space="preserve"> </w:t>
+      </w:r>
+      <w:r>
+        <w:t xml:space="preserve">opérations en dérive.</w:t>
       </w:r>
     </w:p>
     <w:p>
@@ -2134,7 +2124,7 @@
           <wp:inline>
             <wp:extent cx="5067300" cy="1628472"/>
             <wp:effectExtent b="0" l="0" r="0" t="0"/>
-            <wp:docPr descr="Distribution de la variation de marge engagée sur les 123 opérations du périmètre, et seuil de dérive matérielle à -2 %" title="" id="37" name="Picture"/>
+            <wp:docPr descr="Distribution de la variation de marge « committée » sur les 123 opérations du périmètre, et seuil de dérive matérielle à -2 %" title="" id="37" name="Picture"/>
             <a:graphic>
               <a:graphicData uri="http://schemas.openxmlformats.org/drawingml/2006/picture">
                 <pic:pic>
@@ -2177,7 +2167,7 @@
         <w:pStyle w:val="ImageCaption"/>
       </w:pPr>
       <w:r>
-        <w:t xml:space="preserve">Figure 2.3 – Distribution de la variation de marge engagée sur les 123 opérations du périmètre, et seuil de dérive matérielle à -2 %</w:t>
+        <w:t xml:space="preserve">Figure 2.3 – Distribution de la variation de marge « committée » sur les 123 opérations du périmètre, et seuil de dérive matérielle à -2 %</w:t>
       </w:r>
     </w:p>
     <w:p>
@@ -2185,31 +2175,19 @@
         <w:pStyle w:val="BodyText"/>
       </w:pPr>
       <w:r>
-        <w:t xml:space="preserve">Un point mérite d’être dit clairement, parce qu’il va à l’encontre de ce qu’on attend d’un</w:t>
-      </w:r>
-      <w:r>
-        <w:t xml:space="preserve"> </w:t>
-      </w:r>
-      <w:r>
-        <w:t xml:space="preserve">projet de Data Science. La partie la plus utile de cet axe pour l’entreprise n’est pas un</w:t>
-      </w:r>
-      <w:r>
-        <w:t xml:space="preserve"> </w:t>
-      </w:r>
-      <w:r>
-        <w:t xml:space="preserve">modèle appris : c’est le tableau descriptif des dépassements engagés en euros, par</w:t>
-      </w:r>
-      <w:r>
-        <w:t xml:space="preserve"> </w:t>
-      </w:r>
-      <w:r>
-        <w:t xml:space="preserve">opération et par poste, calculé en SQL pur. C’est lui qui alimente la page « Alertes</w:t>
-      </w:r>
-      <w:r>
-        <w:t xml:space="preserve"> </w:t>
-      </w:r>
-      <w:r>
-        <w:t xml:space="preserve">marge » de la plateforme, et c’est lui que les contrôleurs de gestion consultent.</w:t>
+        <w:t xml:space="preserve">La partie la plus utile de cet axe pour l’entreprise n’est pas un modèle appris : c’est le</w:t>
+      </w:r>
+      <w:r>
+        <w:t xml:space="preserve"> </w:t>
+      </w:r>
+      <w:r>
+        <w:t xml:space="preserve">tableau descriptif des dépassements engagés en euros, par opération et par poste, calculé</w:t>
+      </w:r>
+      <w:r>
+        <w:t xml:space="preserve"> </w:t>
+      </w:r>
+      <w:r>
+        <w:t xml:space="preserve">en SQL pur. C’est lui qui alimente la page « Alertes marge » de la plateforme.</w:t>
       </w:r>
     </w:p>
     <w:p>
@@ -2247,13 +2225,19 @@
         <w:t xml:space="preserve"> </w:t>
       </w:r>
       <w:r>
-        <w:t xml:space="preserve">atteint un score F1 de l’ordre de 0,30 à 0,34 en validation croisée stratifiée, contre 0</w:t>
-      </w:r>
-      <w:r>
-        <w:t xml:space="preserve"> </w:t>
-      </w:r>
-      <w:r>
-        <w:t xml:space="preserve">pour la référence majoritaire, qui ne détecte rien du tout. J’ai confronté quatre</w:t>
+        <w:t xml:space="preserve">atteint un score F1 de l’ordre de 0,30 à 0,34 en validation croisée stratifiée, c’est-à-dire</w:t>
+      </w:r>
+      <w:r>
+        <w:t xml:space="preserve"> </w:t>
+      </w:r>
+      <w:r>
+        <w:t xml:space="preserve">sur des découpages qui conservent la proportion d’opérations à risque, contre 0 pour la</w:t>
+      </w:r>
+      <w:r>
+        <w:t xml:space="preserve"> </w:t>
+      </w:r>
+      <w:r>
+        <w:t xml:space="preserve">référence majoritaire, qui ne détecte rien du tout. J’ai confronté quatre</w:t>
       </w:r>
       <w:r>
         <w:t xml:space="preserve"> </w:t>
@@ -2291,19 +2275,7 @@
         <w:t xml:space="preserve"> </w:t>
       </w:r>
       <w:r>
-        <w:t xml:space="preserve">l’attention, pas un oracle. Un score F1 de 0,3 contre une référence à 0 signifie que le</w:t>
-      </w:r>
-      <w:r>
-        <w:t xml:space="preserve"> </w:t>
-      </w:r>
-      <w:r>
-        <w:t xml:space="preserve">modèle détecte quelque chose là où l’approche naïve ne détecte rien, ce qui est utile pour</w:t>
-      </w:r>
-      <w:r>
-        <w:t xml:space="preserve"> </w:t>
-      </w:r>
-      <w:r>
-        <w:t xml:space="preserve">ordonner une revue de gestion, mais ne permet pas de fonder une décision à lui seul.</w:t>
+        <w:t xml:space="preserve">l’attention, pas un oracle.</w:t>
       </w:r>
     </w:p>
     <w:bookmarkEnd w:id="39"/>
@@ -2321,13 +2293,25 @@
         <w:pStyle w:val="FirstParagraph"/>
       </w:pPr>
       <w:r>
-        <w:t xml:space="preserve">C’est l’axe dont les résultats sont les plus solides, et celui qui sert le plus directement</w:t>
-      </w:r>
-      <w:r>
-        <w:t xml:space="preserve"> </w:t>
-      </w:r>
-      <w:r>
-        <w:t xml:space="preserve">la décision budgétaire.</w:t>
+        <w:t xml:space="preserve">Budgéter les réservations de 2026 suppose de distinguer, dans le rythme de vente, ce qui</w:t>
+      </w:r>
+      <w:r>
+        <w:t xml:space="preserve"> </w:t>
+      </w:r>
+      <w:r>
+        <w:t xml:space="preserve">relève de la conjoncture et ce qui relève du programme lui-même. C’est l’axe dont les</w:t>
+      </w:r>
+      <w:r>
+        <w:t xml:space="preserve"> </w:t>
+      </w:r>
+      <w:r>
+        <w:t xml:space="preserve">résultats sont les plus solides, et celui qui sert le plus directement la décision</w:t>
+      </w:r>
+      <w:r>
+        <w:t xml:space="preserve"> </w:t>
+      </w:r>
+      <w:r>
+        <w:t xml:space="preserve">budgétaire.</w:t>
       </w:r>
     </w:p>
     <w:p>
@@ -2441,7 +2425,7 @@
         <w:pStyle w:val="BodyText"/>
       </w:pPr>
       <w:r>
-        <w:t xml:space="preserve">Un garde-fou mérite d’être raconté, parce qu’il fonde la manière dont les scénarios sont</w:t>
+        <w:t xml:space="preserve">J’ai posé un garde-fou méthodologique, qui fonde la manière dont les scénarios sont</w:t>
       </w:r>
       <w:r>
         <w:t xml:space="preserve"> </w:t>
@@ -2453,13 +2437,25 @@
         <w:t xml:space="preserve"> </w:t>
       </w:r>
       <w:r>
-        <w:t xml:space="preserve">dynamique à erreurs ARIMA dans les règles de l’art : vérification que les résidus sont</w:t>
-      </w:r>
-      <w:r>
-        <w:t xml:space="preserve"> </w:t>
-      </w:r>
-      <w:r>
-        <w:t xml:space="preserve">assimilables à un bruit blanc d’abord, sélection du modèle par le critère AICc ensuite.</w:t>
+        <w:t xml:space="preserve">dynamique à erreurs ARIMA, c’est-à-dire une régression dont les résidus sont eux-mêmes</w:t>
+      </w:r>
+      <w:r>
+        <w:t xml:space="preserve"> </w:t>
+      </w:r>
+      <w:r>
+        <w:t xml:space="preserve">modélisés comme une série temporelle, dans les règles de l’art : vérification que ces</w:t>
+      </w:r>
+      <w:r>
+        <w:t xml:space="preserve"> </w:t>
+      </w:r>
+      <w:r>
+        <w:t xml:space="preserve">résidus sont assimilables à un bruit blanc d’abord, sélection du modèle par le critère AICc</w:t>
+      </w:r>
+      <w:r>
+        <w:t xml:space="preserve"> </w:t>
+      </w:r>
+      <w:r>
+        <w:t xml:space="preserve">ensuite, qui arbitre entre qualité d’ajustement et nombre de paramètres.</w:t>
       </w:r>
       <w:r>
         <w:t xml:space="preserve"> </w:t>
@@ -2497,7 +2493,13 @@
         <w:t xml:space="preserve"> </w:t>
       </w:r>
       <w:r>
-        <w:t xml:space="preserve">le panel n’est pas un artefact de régression fallacieuse, puisque la voie temporelle, plus</w:t>
+        <w:t xml:space="preserve">le panel n’est pas un artefact de régression fallacieuse, c’est-à-dire d’une corrélation</w:t>
+      </w:r>
+      <w:r>
+        <w:t xml:space="preserve"> </w:t>
+      </w:r>
+      <w:r>
+        <w:t xml:space="preserve">née de la seule tendance commune des deux séries, puisque la voie temporelle, plus</w:t>
       </w:r>
       <w:r>
         <w:t xml:space="preserve"> </w:t>
@@ -2719,13 +2721,25 @@
         <w:pStyle w:val="FirstParagraph"/>
       </w:pPr>
       <w:r>
-        <w:t xml:space="preserve">Le modèle de prix est volontairement le plus simple qui fonctionne. Il s’agit d’une</w:t>
-      </w:r>
-      <w:r>
-        <w:t xml:space="preserve"> </w:t>
-      </w:r>
-      <w:r>
-        <w:t xml:space="preserve">régression linéaire du logarithme du prix au mètre carré des 5 064 appartements transigés</w:t>
+        <w:t xml:space="preserve">Repricer le stock suppose d’abord de savoir à quel prix un lot devrait se vendre, ce</w:t>
+      </w:r>
+      <w:r>
+        <w:t xml:space="preserve"> </w:t>
+      </w:r>
+      <w:r>
+        <w:t xml:space="preserve">qu’aucune grille commerciale ne dit. Le modèle que j’ai construit pour répondre à cette</w:t>
+      </w:r>
+      <w:r>
+        <w:t xml:space="preserve"> </w:t>
+      </w:r>
+      <w:r>
+        <w:t xml:space="preserve">question est volontairement le plus simple qui fonctionne. Il s’agit d’une régression</w:t>
+      </w:r>
+      <w:r>
+        <w:t xml:space="preserve"> </w:t>
+      </w:r>
+      <w:r>
+        <w:t xml:space="preserve">linéaire du logarithme du prix au mètre carré des 5 064 appartements transigés</w:t>
       </w:r>
       <w:r>
         <w:t xml:space="preserve"> </w:t>
@@ -2763,7 +2777,7 @@
         <w:t xml:space="preserve"> </w:t>
       </w:r>
       <w:r>
-        <w:t xml:space="preserve">lisent comme des prix implicites, permettant de les discuter avec la direction</w:t>
+        <w:t xml:space="preserve">lisent comme des prix implicites, ce qui permet de les discuter avec la direction</w:t>
       </w:r>
       <w:r>
         <w:t xml:space="preserve"> </w:t>
@@ -2856,19 +2870,13 @@
         <w:t xml:space="preserve"> </w:t>
       </w:r>
       <w:r>
-        <w:t xml:space="preserve">baissé avec la remontée des taux : c’est le volume qui s’est ajusté. Les deux axes disent</w:t>
-      </w:r>
-      <w:r>
-        <w:t xml:space="preserve"> </w:t>
-      </w:r>
-      <w:r>
-        <w:t xml:space="preserve">donc la même chose par deux chemins indépendants, renforçant la confiance que l’on peut</w:t>
-      </w:r>
-      <w:r>
-        <w:t xml:space="preserve"> </w:t>
-      </w:r>
-      <w:r>
-        <w:t xml:space="preserve">accorder à l’un comme à l’autre. J’ai également testé une variante régularisée du</w:t>
+        <w:t xml:space="preserve">baissé avec la remontée des taux : c’est le volume qui s’est ajusté, en parfaite cohérence</w:t>
+      </w:r>
+      <w:r>
+        <w:t xml:space="preserve"> </w:t>
+      </w:r>
+      <w:r>
+        <w:t xml:space="preserve">avec l’axe B. J’ai également testé une variante régularisée du</w:t>
       </w:r>
       <w:r>
         <w:t xml:space="preserve"> </w:t>
@@ -3133,19 +3141,7 @@
         <w:t xml:space="preserve"> </w:t>
       </w:r>
       <w:r>
-        <w:t xml:space="preserve">agence inanalysables tant que la saisie n’est pas fiabilisée. Ce constat n’est pas un</w:t>
-      </w:r>
-      <w:r>
-        <w:t xml:space="preserve"> </w:t>
-      </w:r>
-      <w:r>
-        <w:t xml:space="preserve">résultat d’analyse au sens strict, mais c’est une information directement actionnable, et</w:t>
-      </w:r>
-      <w:r>
-        <w:t xml:space="preserve"> </w:t>
-      </w:r>
-      <w:r>
-        <w:t xml:space="preserve">elle n’aurait pas été visible sans ce travail.</w:t>
+        <w:t xml:space="preserve">agence inanalysables tant que la saisie n’est pas fiabilisée.</w:t>
       </w:r>
     </w:p>
     <w:p>
@@ -3203,7 +3199,7 @@
         <w:t xml:space="preserve"> </w:t>
       </w:r>
       <w:r>
-        <w:t xml:space="preserve">Ce résultat plafonne à un score F1 de 0,34 : le texte seul ne suffit pas, et il est donc</w:t>
+        <w:t xml:space="preserve">Cette tentative plafonne à un score F1 de 0,34 : le texte seul ne suffit pas, et il est donc</w:t>
       </w:r>
       <w:r>
         <w:t xml:space="preserve"> </w:t>
@@ -3868,19 +3864,19 @@
         <w:t xml:space="preserve"> </w:t>
       </w:r>
       <w:r>
-        <w:t xml:space="preserve">recommandations qui terminent le chapitre 2, historiser les exports mensuels et fiabiliser</w:t>
-      </w:r>
-      <w:r>
-        <w:t xml:space="preserve"> </w:t>
-      </w:r>
-      <w:r>
-        <w:t xml:space="preserve">la saisie des motifs de désistement, sont exactement de la même nature que le travail</w:t>
-      </w:r>
-      <w:r>
-        <w:t xml:space="preserve"> </w:t>
-      </w:r>
-      <w:r>
-        <w:t xml:space="preserve">décrit au chapitre 1. Ce sont des travaux de structure, faits pour rendre possible une</w:t>
+        <w:t xml:space="preserve">deux recommandations de ce chapitre, historiser les exports mensuels et fiabiliser la</w:t>
+      </w:r>
+      <w:r>
+        <w:t xml:space="preserve"> </w:t>
+      </w:r>
+      <w:r>
+        <w:t xml:space="preserve">saisie des motifs de désistement, sont exactement de la même nature que le travail décrit</w:t>
+      </w:r>
+      <w:r>
+        <w:t xml:space="preserve"> </w:t>
+      </w:r>
+      <w:r>
+        <w:t xml:space="preserve">au chapitre 1. Ce sont des travaux de structure, faits pour rendre possible une</w:t>
       </w:r>
       <w:r>
         <w:t xml:space="preserve"> </w:t>
@@ -3936,7 +3932,7 @@
         <w:t xml:space="preserve"> </w:t>
       </w:r>
       <w:r>
-        <w:t xml:space="preserve">application utilisée par la direction financière.</w:t>
+        <w:t xml:space="preserve">application destinée à la direction financière.</w:t>
       </w:r>
     </w:p>
     <w:p>
@@ -3962,25 +3958,19 @@
         <w:t xml:space="preserve"> </w:t>
       </w:r>
       <w:r>
-        <w:t xml:space="preserve">chose. Ce sont des décisions modestes en apparence, invisibles dans le résultat final, et</w:t>
-      </w:r>
-      <w:r>
-        <w:t xml:space="preserve"> </w:t>
-      </w:r>
-      <w:r>
-        <w:t xml:space="preserve">pourtant ce sont elles qui déterminent si le résultat vaut quelque chose. Le métier de</w:t>
-      </w:r>
-      <w:r>
-        <w:t xml:space="preserve"> </w:t>
-      </w:r>
-      <w:r>
-        <w:t xml:space="preserve">gestionnaire d’information, tel que je l’ai pratiqué cette année, consiste largement à</w:t>
-      </w:r>
-      <w:r>
-        <w:t xml:space="preserve"> </w:t>
-      </w:r>
-      <w:r>
-        <w:t xml:space="preserve">prendre ces décisions-là, à les écrire, et à les rendre vérifiables par d’autres.</w:t>
+        <w:t xml:space="preserve">chose. Le métier de gestionnaire d’information, tel que je l’ai pratiqué cette année,</w:t>
+      </w:r>
+      <w:r>
+        <w:t xml:space="preserve"> </w:t>
+      </w:r>
+      <w:r>
+        <w:t xml:space="preserve">consiste largement à prendre ces décisions-là, à les écrire, et à les rendre vérifiables</w:t>
+      </w:r>
+      <w:r>
+        <w:t xml:space="preserve"> </w:t>
+      </w:r>
+      <w:r>
+        <w:t xml:space="preserve">par d’autres.</w:t>
       </w:r>
     </w:p>
     <w:p>

</xml_diff>

<commit_message>
Rend réellement insécables les espaces devant % et les montants
La substitution précédente remplaçait une espace ordinaire par une
espace ordinaire : « 1 754,8 M€ » se coupait encore en fin de ligne.
Plus aucune coupure de nombre, de pourcentage ni de montant dans les
deux PDF rendus.

Co-Authored-By: Claude Opus 5 <noreply@anthropic.com>
Claude-Session: https://claude.ai/code/session_01Hs8PVJaTgyjq9e8Ud5Nqb9
</commit_message>
<xml_diff>
--- a/chapitre_2_copilote_financier.docx
+++ b/chapitre_2_copilote_financier.docx
@@ -500,13 +500,13 @@
         <w:t xml:space="preserve"> </w:t>
       </w:r>
       <w:r>
-        <w:t xml:space="preserve">taux moyen des crédits habitat est passé d’environ 1,1 % à un pic de 3,6 % fin 2023, avant</w:t>
-      </w:r>
-      <w:r>
-        <w:t xml:space="preserve"> </w:t>
-      </w:r>
-      <w:r>
-        <w:t xml:space="preserve">de refluer vers 3,1 % mi-2026, et le rythme du groupe est tombé d’environ 150 à moins de</w:t>
+        <w:t xml:space="preserve">taux moyen des crédits habitat est passé d’environ 1,1 % à un pic de 3,6 % fin 2023, avant</w:t>
+      </w:r>
+      <w:r>
+        <w:t xml:space="preserve"> </w:t>
+      </w:r>
+      <w:r>
+        <w:t xml:space="preserve">de refluer vers 3,1 % mi-2026, et le rythme du groupe est tombé d’environ 150 à moins de</w:t>
       </w:r>
       <w:r>
         <w:t xml:space="preserve"> </w:t>
@@ -532,7 +532,7 @@
         <w:t xml:space="preserve"> </w:t>
       </w:r>
       <w:r>
-        <w:t xml:space="preserve">pas théorique, puisque 45 % des 2 157 désistements enregistrés ont pour motif un problème</w:t>
+        <w:t xml:space="preserve">pas théorique, puisque 45 % des 2 157 désistements enregistrés ont pour motif un problème</w:t>
       </w:r>
       <w:r>
         <w:t xml:space="preserve"> </w:t>
@@ -1898,7 +1898,7 @@
         <w:t xml:space="preserve"> </w:t>
       </w:r>
       <w:r>
-        <w:t xml:space="preserve">totaux par deux moteurs indépendants, soit 1 561,8 M€ de dépenses budgétées et 1 754,8 M€</w:t>
+        <w:t xml:space="preserve">totaux par deux moteurs indépendants, soit 1 561,8 M€ de dépenses budgétées et 1 754,8 M€</w:t>
       </w:r>
       <w:r>
         <w:t xml:space="preserve"> </w:t>
@@ -2082,25 +2082,25 @@
         <w:pStyle w:val="BodyText"/>
       </w:pPr>
       <w:r>
-        <w:t xml:space="preserve">Sur le périmètre exploitable, soit les 123 opérations engagées à au moins 60 % et dont la</w:t>
-      </w:r>
-      <w:r>
-        <w:t xml:space="preserve"> </w:t>
-      </w:r>
-      <w:r>
-        <w:t xml:space="preserve">marge budgétée dépasse 50 k€, plus d’un tiers des opérations, 36,6 % exactement, n’a aucun</w:t>
-      </w:r>
-      <w:r>
-        <w:t xml:space="preserve"> </w:t>
-      </w:r>
-      <w:r>
-        <w:t xml:space="preserve">dépassement engagé. Mais 28 % franchissent le seuil de dérive matérielle, que j’ai fixé à</w:t>
-      </w:r>
-      <w:r>
-        <w:t xml:space="preserve"> </w:t>
-      </w:r>
-      <w:r>
-        <w:t xml:space="preserve">2 % de la marge, et deux cas extrêmes dépassent la moitié de la marge budgétée. La</w:t>
+        <w:t xml:space="preserve">Sur le périmètre exploitable, soit les 123 opérations engagées à au moins 60 % et dont la</w:t>
+      </w:r>
+      <w:r>
+        <w:t xml:space="preserve"> </w:t>
+      </w:r>
+      <w:r>
+        <w:t xml:space="preserve">marge budgétée dépasse 50 k€, plus d’un tiers des opérations, 36,6 % exactement, n’a aucun</w:t>
+      </w:r>
+      <w:r>
+        <w:t xml:space="preserve"> </w:t>
+      </w:r>
+      <w:r>
+        <w:t xml:space="preserve">dépassement engagé. Mais 28 % franchissent le seuil de dérive matérielle, que j’ai fixé à</w:t>
+      </w:r>
+      <w:r>
+        <w:t xml:space="preserve"> </w:t>
+      </w:r>
+      <w:r>
+        <w:t xml:space="preserve">2 % de la marge, et deux cas extrêmes dépassent la moitié de la marge budgétée. La</w:t>
       </w:r>
       <w:r>
         <w:t xml:space="preserve"> </w:t>
@@ -2124,7 +2124,7 @@
           <wp:inline>
             <wp:extent cx="5067300" cy="1628472"/>
             <wp:effectExtent b="0" l="0" r="0" t="0"/>
-            <wp:docPr descr="Distribution de la variation de marge « committée » sur les 123 opérations du périmètre, et seuil de dérive matérielle à -2 %" title="" id="37" name="Picture"/>
+            <wp:docPr descr="Distribution de la variation de marge « committée » sur les 123 opérations du périmètre, et seuil de dérive matérielle à -2 %" title="" id="37" name="Picture"/>
             <a:graphic>
               <a:graphicData uri="http://schemas.openxmlformats.org/drawingml/2006/picture">
                 <pic:pic>
@@ -2167,7 +2167,7 @@
         <w:pStyle w:val="ImageCaption"/>
       </w:pPr>
       <w:r>
-        <w:t xml:space="preserve">Figure 2.3 – Distribution de la variation de marge « committée » sur les 123 opérations du périmètre, et seuil de dérive matérielle à -2 %</w:t>
+        <w:t xml:space="preserve">Figure 2.3 – Distribution de la variation de marge « committée » sur les 123 opérations du périmètre, et seuil de dérive matérielle à -2 %</w:t>
       </w:r>
     </w:p>
     <w:p>
@@ -2219,7 +2219,7 @@
         <w:t xml:space="preserve"> </w:t>
       </w:r>
       <w:r>
-        <w:t xml:space="preserve">classification des opérations « à risque », c’est-à-dire dont la dérive dépasse 2 %,</w:t>
+        <w:t xml:space="preserve">classification des opérations « à risque », c’est-à-dire dont la dérive dépasse 2 %,</w:t>
       </w:r>
       <w:r>
         <w:t xml:space="preserve"> </w:t>
@@ -2393,7 +2393,7 @@
           <w:bCs/>
           <w:b/>
         </w:rPr>
-        <w:t xml:space="preserve">de taux réduit les réservations mensuelles d’environ 19 %</w:t>
+        <w:t xml:space="preserve">de taux réduit les réservations mensuelles d’environ 19 %</w:t>
       </w:r>
       <w:r>
         <w:t xml:space="preserve">, pour un coefficient de -0,216</w:t>
@@ -2529,13 +2529,13 @@
         <w:t xml:space="preserve"> </w:t>
       </w:r>
       <w:r>
-        <w:t xml:space="preserve">présentée en Figure 2.4, une détente à 2,5 % fin 2026 redonnerait environ +6 % de rythme en</w:t>
-      </w:r>
-      <w:r>
-        <w:t xml:space="preserve"> </w:t>
-      </w:r>
-      <w:r>
-        <w:t xml:space="preserve">moyenne sur douze mois, tandis qu’une remontée à 3,5 % en retirerait 3 %.</w:t>
+        <w:t xml:space="preserve">présentée en Figure 2.4, une détente à 2,5 % fin 2026 redonnerait environ +6 % de rythme en</w:t>
+      </w:r>
+      <w:r>
+        <w:t xml:space="preserve"> </w:t>
+      </w:r>
+      <w:r>
+        <w:t xml:space="preserve">moyenne sur douze mois, tandis qu’une remontée à 3,5 % en retirerait 3 %.</w:t>
       </w:r>
     </w:p>
     <w:p>
@@ -2547,7 +2547,7 @@
           <wp:inline>
             <wp:extent cx="5067300" cy="1903409"/>
             <wp:effectExtent b="0" l="0" r="0" t="0"/>
-            <wp:docPr descr="Prévision d’intensité de vente à douze mois sous trois scénarios de taux 2026, avec intervalle à 80 %" title="" id="41" name="Picture"/>
+            <wp:docPr descr="Prévision d’intensité de vente à douze mois sous trois scénarios de taux 2026, avec intervalle à 80 %" title="" id="41" name="Picture"/>
             <a:graphic>
               <a:graphicData uri="http://schemas.openxmlformats.org/drawingml/2006/picture">
                 <pic:pic>
@@ -2590,7 +2590,7 @@
         <w:pStyle w:val="ImageCaption"/>
       </w:pPr>
       <w:r>
-        <w:t xml:space="preserve">Figure 2.4 – Prévision d’intensité de vente à douze mois sous trois scénarios de taux 2026, avec intervalle à 80 %</w:t>
+        <w:t xml:space="preserve">Figure 2.4 – Prévision d’intensité de vente à douze mois sous trois scénarios de taux 2026, avec intervalle à 80 %</w:t>
       </w:r>
     </w:p>
     <w:p>
@@ -2622,7 +2622,7 @@
         <w:t xml:space="preserve"> </w:t>
       </w:r>
       <w:r>
-        <w:t xml:space="preserve">directement utile à la trésorerie : le délai d’atteinte de 90 % du potentiel de vente, dont</w:t>
+        <w:t xml:space="preserve">directement utile à la trésorerie : le délai d’atteinte de 90 % du potentiel de vente, dont</w:t>
       </w:r>
       <w:r>
         <w:t xml:space="preserve"> </w:t>
@@ -2640,7 +2640,7 @@
           <wp:inline>
             <wp:extent cx="5067300" cy="2973549"/>
             <wp:effectExtent b="0" l="0" r="0" t="0"/>
-            <wp:docPr descr="Réservations cumulées et courbes logistiques ajustées sur quatre opérations terminées, avec le repère des 90 % du potentiel" title="" id="44" name="Picture"/>
+            <wp:docPr descr="Réservations cumulées et courbes logistiques ajustées sur quatre opérations terminées, avec le repère des 90 % du potentiel" title="" id="44" name="Picture"/>
             <a:graphic>
               <a:graphicData uri="http://schemas.openxmlformats.org/drawingml/2006/picture">
                 <pic:pic>
@@ -2683,7 +2683,7 @@
         <w:pStyle w:val="ImageCaption"/>
       </w:pPr>
       <w:r>
-        <w:t xml:space="preserve">Figure 2.5 – Réservations cumulées et courbes logistiques ajustées sur quatre opérations terminées, avec le repère des 90 % du potentiel</w:t>
+        <w:t xml:space="preserve">Figure 2.5 – Réservations cumulées et courbes logistiques ajustées sur quatre opérations terminées, avec le repère des 90 % du potentiel</w:t>
       </w:r>
     </w:p>
     <w:p>
@@ -2757,13 +2757,13 @@
         <w:t xml:space="preserve"> </w:t>
       </w:r>
       <w:r>
-        <w:t xml:space="preserve">que par leur année de réservation. Ce modèle explique 88,6 % de la variance sur</w:t>
-      </w:r>
-      <w:r>
-        <w:t xml:space="preserve"> </w:t>
-      </w:r>
-      <w:r>
-        <w:t xml:space="preserve">l’échantillon test, avec une erreur type d’environ 11 % sur le prix.</w:t>
+        <w:t xml:space="preserve">que par leur année de réservation. Ce modèle explique 88,6 % de la variance sur</w:t>
+      </w:r>
+      <w:r>
+        <w:t xml:space="preserve"> </w:t>
+      </w:r>
+      <w:r>
+        <w:t xml:space="preserve">l’échantillon test, avec une erreur type d’environ 11 % sur le prix.</w:t>
       </w:r>
     </w:p>
     <w:p>
@@ -2783,13 +2783,13 @@
         <w:t xml:space="preserve"> </w:t>
       </w:r>
       <w:r>
-        <w:t xml:space="preserve">commerciale. On y lit une prime d’étage de +6 %, une prime d’exposition sud, une décote de</w:t>
-      </w:r>
-      <w:r>
-        <w:t xml:space="preserve"> </w:t>
-      </w:r>
-      <w:r>
-        <w:t xml:space="preserve">63 % pour le logement social, qui s’explique par des prix réglementés, et un effet millésime</w:t>
+        <w:t xml:space="preserve">commerciale. On y lit une prime d’étage de +6 %, une prime d’exposition sud, une décote de</w:t>
+      </w:r>
+      <w:r>
+        <w:t xml:space="preserve"> </w:t>
+      </w:r>
+      <w:r>
+        <w:t xml:space="preserve">63 % pour le logement social, qui s’explique par des prix réglementés, et un effet millésime</w:t>
       </w:r>
       <w:r>
         <w:t xml:space="preserve"> </w:t>
@@ -2989,7 +2989,7 @@
         <w:t xml:space="preserve"> </w:t>
       </w:r>
       <w:r>
-        <w:t xml:space="preserve">prix dans des bornes commerciales de -10 à +5 %, sous un objectif d’accélération de</w:t>
+        <w:t xml:space="preserve">prix dans des bornes commerciales de -10 à +5 %, sous un objectif d’accélération de</w:t>
       </w:r>
       <w:r>
         <w:t xml:space="preserve"> </w:t>
@@ -3035,7 +3035,7 @@
         <w:t xml:space="preserve"> </w:t>
       </w:r>
       <w:r>
-        <w:t xml:space="preserve">est uniforme en euros sur tous les lots, de l’ordre de 23 k€ par lot sur l’opération</w:t>
+        <w:t xml:space="preserve">est uniforme en euros sur tous les lots, de l’ordre de 23 k€ par lot sur l’opération</w:t>
       </w:r>
       <w:r>
         <w:t xml:space="preserve"> </w:t>
@@ -3053,13 +3053,13 @@
         <w:t xml:space="preserve"> </w:t>
       </w:r>
       <w:r>
-        <w:t xml:space="preserve">test, qui compte 18 appartements en stock, viser +8 % d’écoulement déplace le volume</w:t>
-      </w:r>
-      <w:r>
-        <w:t xml:space="preserve"> </w:t>
-      </w:r>
-      <w:r>
-        <w:t xml:space="preserve">attendu de 6,8 à 7,4 lots pour un revenu quasi inchangé, en recul de 0,3 %. L’intérêt de la</w:t>
+        <w:t xml:space="preserve">test, qui compte 18 appartements en stock, viser +8 % d’écoulement déplace le volume</w:t>
+      </w:r>
+      <w:r>
+        <w:t xml:space="preserve"> </w:t>
+      </w:r>
+      <w:r>
+        <w:t xml:space="preserve">attendu de 6,8 à 7,4 lots pour un revenu quasi inchangé, en recul de 0,3 %. L’intérêt de la</w:t>
       </w:r>
       <w:r>
         <w:t xml:space="preserve"> </w:t>
@@ -3135,7 +3135,7 @@
         <w:t xml:space="preserve"> </w:t>
       </w:r>
       <w:r>
-        <w:t xml:space="preserve">90 % des motifs sont enregistrés en « Autres motifs », rendant les désistements de cette</w:t>
+        <w:t xml:space="preserve">90 % des motifs sont enregistrés en « Autres motifs », rendant les désistements de cette</w:t>
       </w:r>
       <w:r>
         <w:t xml:space="preserve"> </w:t>
@@ -3155,19 +3155,19 @@
         <w:t xml:space="preserve"> </w:t>
       </w:r>
       <w:r>
-        <w:t xml:space="preserve">acteurs, le réseau interne et un prescripteur externe, portent à eux seuls 51,6 % des</w:t>
-      </w:r>
-      <w:r>
-        <w:t xml:space="preserve"> </w:t>
-      </w:r>
-      <w:r>
-        <w:t xml:space="preserve">dossiers attribués, avec des taux de désistement allant du simple au triple : 9 % pour le</w:t>
-      </w:r>
-      <w:r>
-        <w:t xml:space="preserve"> </w:t>
-      </w:r>
-      <w:r>
-        <w:t xml:space="preserve">réseau interne contre 29,6 % pour le prescripteur externe. L’écart a une traduction</w:t>
+        <w:t xml:space="preserve">acteurs, le réseau interne et un prescripteur externe, portent à eux seuls 51,6 % des</w:t>
+      </w:r>
+      <w:r>
+        <w:t xml:space="preserve"> </w:t>
+      </w:r>
+      <w:r>
+        <w:t xml:space="preserve">dossiers attribués, avec des taux de désistement allant du simple au triple : 9 % pour le</w:t>
+      </w:r>
+      <w:r>
+        <w:t xml:space="preserve"> </w:t>
+      </w:r>
+      <w:r>
+        <w:t xml:space="preserve">réseau interne contre 29,6 % pour le prescripteur externe. L’écart a une traduction</w:t>
       </w:r>
       <w:r>
         <w:t xml:space="preserve"> </w:t>
@@ -3275,7 +3275,7 @@
         <w:t xml:space="preserve"> </w:t>
       </w:r>
       <w:r>
-        <w:t xml:space="preserve">de 4,8 réservations par opération et par mois, pour un taux de crédit à 3,11 %.</w:t>
+        <w:t xml:space="preserve">de 4,8 réservations par opération et par mois, pour un taux de crédit à 3,11 %.</w:t>
       </w:r>
     </w:p>
     <w:p>

</xml_diff>

<commit_message>
Retire une inférence sur les grilles commerciales à l'ouverture de 2.4.5
Co-Authored-By: Claude Opus 5 <noreply@anthropic.com>
Claude-Session: https://claude.ai/code/session_01Hs8PVJaTgyjq9e8Ud5Nqb9
</commit_message>
<xml_diff>
--- a/chapitre_2_copilote_financier.docx
+++ b/chapitre_2_copilote_financier.docx
@@ -2721,19 +2721,19 @@
         <w:pStyle w:val="FirstParagraph"/>
       </w:pPr>
       <w:r>
-        <w:t xml:space="preserve">Repricer le stock suppose d’abord de savoir à quel prix un lot devrait se vendre, ce</w:t>
-      </w:r>
-      <w:r>
-        <w:t xml:space="preserve"> </w:t>
-      </w:r>
-      <w:r>
-        <w:t xml:space="preserve">qu’aucune grille commerciale ne dit. Le modèle que j’ai construit pour répondre à cette</w:t>
-      </w:r>
-      <w:r>
-        <w:t xml:space="preserve"> </w:t>
-      </w:r>
-      <w:r>
-        <w:t xml:space="preserve">question est volontairement le plus simple qui fonctionne. Il s’agit d’une régression</w:t>
+        <w:t xml:space="preserve">Repricer le stock suppose d’abord de savoir à quel prix chaque lot devrait se vendre. Le</w:t>
+      </w:r>
+      <w:r>
+        <w:t xml:space="preserve"> </w:t>
+      </w:r>
+      <w:r>
+        <w:t xml:space="preserve">modèle que j’ai construit pour répondre à cette question est volontairement le plus simple</w:t>
+      </w:r>
+      <w:r>
+        <w:t xml:space="preserve"> </w:t>
+      </w:r>
+      <w:r>
+        <w:t xml:space="preserve">qui fonctionne. Il s’agit d’une régression</w:t>
       </w:r>
       <w:r>
         <w:t xml:space="preserve"> </w:t>

</xml_diff>